<commit_message>
feat: add serial isolated deepdive stage 2
</commit_message>
<xml_diff>
--- a/docs/AI知识地图-理解原理页第二阶段执行方案.docx
+++ b/docs/AI知识地图-理解原理页第二阶段执行方案.docx
@@ -49,7 +49,7 @@
           <w:color w:val="667085"/>
           <w:sz w:val="26"/>
         </w:rPr>
-        <w:t>逐页隔离写作 · 独立六问审计 · 状态机调度 · 异常人工接管</w:t>
+        <w:t>存量先审计 · 新节点才写作 · 串行单页任务 · 材料与发布权限隔离</w:t>
       </w:r>
     </w:p>
     <w:p>
@@ -87,7 +87,7 @@
           <w:color w:val="0B2545"/>
           <w:sz w:val="21"/>
         </w:rPr>
-        <w:t>适用范围：</w:t>
+        <w:t>适用范围：130 个存量页面、视频补充和以后批准的新节点</w:t>
       </w:r>
       <w:r>
         <w:rPr>
@@ -95,7 +95,6 @@
           <w:color w:val="111111"/>
           <w:sz w:val="21"/>
         </w:rPr>
-        <w:t>130 个节点的「理解原理」页</w:t>
       </w:r>
     </w:p>
     <w:p>
@@ -133,7 +132,7 @@
           <w:color w:val="0B2545"/>
           <w:sz w:val="21"/>
         </w:rPr>
-        <w:t>建议并发：</w:t>
+        <w:t>执行方式：每次定时运行只处理 1 页的 1 个阶段，不并行</w:t>
       </w:r>
       <w:r>
         <w:rPr>
@@ -141,7 +140,6 @@
           <w:color w:val="111111"/>
           <w:sz w:val="21"/>
         </w:rPr>
-        <w:t>每轮 3 个独立写作任务，每个任务只处理 1 页</w:t>
       </w:r>
     </w:p>
     <w:p>
@@ -156,7 +154,7 @@
           <w:color w:val="0B2545"/>
           <w:sz w:val="21"/>
         </w:rPr>
-        <w:t>版本日期：</w:t>
+        <w:t>版本日期：2026-07-29</w:t>
       </w:r>
       <w:r>
         <w:rPr>
@@ -164,7 +162,6 @@
           <w:color w:val="111111"/>
           <w:sz w:val="21"/>
         </w:rPr>
-        <w:t>2026-07-28</w:t>
       </w:r>
     </w:p>
     <w:p>
@@ -193,7 +190,7 @@
           <w:color w:val="0B2545"/>
           <w:sz w:val="22"/>
         </w:rPr>
-        <w:t xml:space="preserve">核心结论  </w:t>
+        <w:t>核心结论  自动化由仓库内的可信控制器和 Codex 桌面定时任务共同完成。130 个已有页面从独立审计开始，只有新节点从零写作；每次运行创建全新无项目对话，只通过窄 MCP 领取一个最小任务包，提交一次后结束。</w:t>
       </w:r>
       <w:r>
         <w:rPr>
@@ -201,7 +198,6 @@
           <w:color w:val="111111"/>
           <w:sz w:val="22"/>
         </w:rPr>
-        <w:t>自动化应当批量调度彼此隔离的单页任务，而不是让一个写作上下文连续生产多页。总控话题只维护队列、哈希和状态；写作、审计与返修分别使用全新上下文。</w:t>
       </w:r>
     </w:p>
     <w:p>
@@ -230,7 +226,7 @@
           <w:color w:val="111111"/>
           <w:sz w:val="22"/>
         </w:rPr>
-        <w:t>第一阶段已经完成 130 个节点的页面覆盖，但“页面存在”不等于“教学质量通过”。第二阶段的目标不是继续增加正文，而是逐页消除新概念未解释、章节质量参差、句式模板化和六问收束段等问题，并让每一次状态声明都有可追溯证据。</w:t>
+        <w:t>第一阶段已经完成 130 个节点的页面覆盖，因此第二阶段不是重新生成 130 页。它负责逐页独立审计；只有发现缺陷时返修，已有节点收到新材料时融合更新，真正出现新节点时才从零写作。</w:t>
       </w:r>
     </w:p>
     <w:p>
@@ -268,7 +264,7 @@
           <w:color w:val="111111"/>
           <w:sz w:val="22"/>
         </w:rPr>
-        <w:t>避免同一上下文连续修改多页时发生节奏、句式和章节骨架复制。</w:t>
+        <w:t>避免不同页面和不同阶段共享聊天历史，减少节奏、句式和章节骨架复制。</w:t>
       </w:r>
     </w:p>
     <w:p>
@@ -287,7 +283,7 @@
           <w:color w:val="111111"/>
           <w:sz w:val="22"/>
         </w:rPr>
-        <w:t>正文一旦变化，自动使旧审计失效，阻止过期证据继续冒充通过。</w:t>
+        <w:t>正文一旦变化，自动使旧审计失效；候选页通过门禁前不得进入正式文件。</w:t>
       </w:r>
     </w:p>
     <w:p>
@@ -306,7 +302,7 @@
           <w:color w:val="111111"/>
           <w:sz w:val="22"/>
         </w:rPr>
-        <w:t>将自动 L3、人工待审和 L4 认证分开记录，避免项目状态再次失真。</w:t>
+        <w:t>教程轨保持原流程；概念轨只交付补充或新节点事实包，理解原理页由第二阶段独占。</w:t>
       </w:r>
     </w:p>
     <w:p>
@@ -712,7 +708,7 @@
           <w:color w:val="0B2545"/>
           <w:sz w:val="19"/>
         </w:rPr>
-        <w:t>130 页队列</w:t>
+        <w:t>130 个存量页面 -&gt; audit-queued（其中有新补充的页面 -&gt; update-queued）</w:t>
       </w:r>
     </w:p>
     <w:p>
@@ -727,7 +723,7 @@
           <w:color w:val="0B2545"/>
           <w:sz w:val="19"/>
         </w:rPr>
-        <w:t xml:space="preserve">  -&gt; 每次领取 3 页</w:t>
+        <w:t xml:space="preserve">  -&gt; 定时任务创建一个全新无项目 Codex 对话</w:t>
       </w:r>
     </w:p>
     <w:p>
@@ -742,7 +738,7 @@
           <w:color w:val="0B2545"/>
           <w:sz w:val="19"/>
         </w:rPr>
-        <w:t xml:space="preserve">  -&gt; 每页创建独立写作任务</w:t>
+        <w:t xml:space="preserve">  -&gt; 通过窄 MCP 领取一页的一个阶段</w:t>
       </w:r>
     </w:p>
     <w:p>
@@ -757,7 +753,7 @@
           <w:color w:val="0B2545"/>
           <w:sz w:val="19"/>
         </w:rPr>
-        <w:t xml:space="preserve">  -&gt; 冻结正文并运行结构检查</w:t>
+        <w:t xml:space="preserve">  -&gt; write / update / audit / repair 四选一</w:t>
       </w:r>
     </w:p>
     <w:p>
@@ -772,7 +768,7 @@
           <w:color w:val="0B2545"/>
           <w:sz w:val="19"/>
         </w:rPr>
-        <w:t xml:space="preserve">  -&gt; 每页创建独立审计任务</w:t>
+        <w:t xml:space="preserve">  -&gt; 提交候选或独立审计，然后本次任务结束</w:t>
       </w:r>
     </w:p>
     <w:p>
@@ -787,7 +783,7 @@
           <w:color w:val="0B2545"/>
           <w:sz w:val="19"/>
         </w:rPr>
-        <w:t xml:space="preserve">  -&gt; 运行严格 L3</w:t>
+        <w:t xml:space="preserve">  -&gt; 控制器运行严格 L1/L3、哈希校验和全局验证</w:t>
       </w:r>
     </w:p>
     <w:p>
@@ -802,7 +798,7 @@
           <w:color w:val="0B2545"/>
           <w:sz w:val="19"/>
         </w:rPr>
-        <w:t xml:space="preserve">  -&gt; 自动通过 / 返修 / 人工接管</w:t>
+        <w:t xml:space="preserve">  -&gt; 原子发布 / 返修 / 人工接管</w:t>
       </w:r>
     </w:p>
     <w:p>
@@ -815,7 +811,7 @@
           <w:color w:val="111111"/>
           <w:sz w:val="22"/>
         </w:rPr>
-        <w:t>总控话题不参与正文创作。它只读取状态文件、生成任务包、创建子任务、应用候选补丁、运行门禁和更新结果。这样即使总控上下文持续增长，它也不会把先前页面的写作节奏带进下一页。</w:t>
+        <w:t>可信控制器不参与正文创作。它只维护状态、租约、私有审计、哈希和正式发布。内容 Agent 既看不到整个项目，也没有直接写正式页面的入口。</w:t>
       </w:r>
     </w:p>
     <w:p>
@@ -865,17 +861,7 @@
             <w:shd w:fill="E8EEF5"/>
           </w:tcPr>
           <w:p>
-            <w:pPr>
-              <w:spacing w:after="0"/>
-              <w:jc w:val="center"/>
-            </w:pPr>
             <w:r>
-              <w:rPr>
-                <w:rFonts w:ascii="Calibri" w:hAnsi="Calibri" w:eastAsia="Microsoft YaHei"/>
-                <w:b/>
-                <w:color w:val="0B2545"/>
-                <w:sz w:val="19"/>
-              </w:rPr>
               <w:t>状态</w:t>
             </w:r>
           </w:p>
@@ -893,17 +879,7 @@
             <w:shd w:fill="E8EEF5"/>
           </w:tcPr>
           <w:p>
-            <w:pPr>
-              <w:spacing w:after="0"/>
-              <w:jc w:val="center"/>
-            </w:pPr>
             <w:r>
-              <w:rPr>
-                <w:rFonts w:ascii="Calibri" w:hAnsi="Calibri" w:eastAsia="Microsoft YaHei"/>
-                <w:b/>
-                <w:color w:val="0B2545"/>
-                <w:sz w:val="19"/>
-              </w:rPr>
               <w:t>含义</w:t>
             </w:r>
           </w:p>
@@ -921,17 +897,7 @@
             <w:shd w:fill="E8EEF5"/>
           </w:tcPr>
           <w:p>
-            <w:pPr>
-              <w:spacing w:after="0"/>
-              <w:jc w:val="center"/>
-            </w:pPr>
             <w:r>
-              <w:rPr>
-                <w:rFonts w:ascii="Calibri" w:hAnsi="Calibri" w:eastAsia="Microsoft YaHei"/>
-                <w:b/>
-                <w:color w:val="0B2545"/>
-                <w:sz w:val="19"/>
-              </w:rPr>
               <w:t>允许的下一步</w:t>
             </w:r>
           </w:p>
@@ -943,17 +909,8 @@
             <w:tcW w:type="dxa" w:w="2100"/>
           </w:tcPr>
           <w:p>
-            <w:pPr>
-              <w:spacing w:after="0"/>
-              <w:jc w:val="center"/>
-            </w:pPr>
             <w:r>
-              <w:rPr>
-                <w:rFonts w:ascii="Calibri" w:hAnsi="Calibri" w:eastAsia="Microsoft YaHei"/>
-                <w:color w:val="111111"/>
-                <w:sz w:val="19"/>
-              </w:rPr>
-              <w:t>queued</w:t>
+              <w:t>audit-queued</w:t>
             </w:r>
           </w:p>
         </w:tc>
@@ -962,17 +919,8 @@
             <w:tcW w:type="dxa" w:w="3900"/>
           </w:tcPr>
           <w:p>
-            <w:pPr>
-              <w:spacing w:after="0"/>
-              <w:jc w:val="left"/>
-            </w:pPr>
             <w:r>
-              <w:rPr>
-                <w:rFonts w:ascii="Calibri" w:hAnsi="Calibri" w:eastAsia="Microsoft YaHei"/>
-                <w:color w:val="111111"/>
-                <w:sz w:val="19"/>
-              </w:rPr>
-              <w:t>等待领取，尚未开始本轮工作。</w:t>
+              <w:t>存量页面或候选页等待独立审计。</w:t>
             </w:r>
           </w:p>
         </w:tc>
@@ -981,16 +929,135 @@
             <w:tcW w:type="dxa" w:w="3360"/>
           </w:tcPr>
           <w:p>
-            <w:pPr>
-              <w:spacing w:after="0"/>
-              <w:jc w:val="left"/>
-            </w:pPr>
             <w:r>
-              <w:rPr>
-                <w:rFonts w:ascii="Calibri" w:hAnsi="Calibri" w:eastAsia="Microsoft YaHei"/>
-                <w:color w:val="111111"/>
-                <w:sz w:val="19"/>
-              </w:rPr>
+              <w:t>auditing</w:t>
+            </w:r>
+          </w:p>
+        </w:tc>
+      </w:tr>
+      <w:tr>
+        <w:tc>
+          <w:tcPr>
+            <w:tcW w:type="dxa" w:w="2100"/>
+          </w:tcPr>
+          <w:p>
+            <w:r>
+              <w:t>auditing</w:t>
+            </w:r>
+          </w:p>
+        </w:tc>
+        <w:tc>
+          <w:tcPr>
+            <w:tcW w:type="dxa" w:w="3900"/>
+          </w:tcPr>
+          <w:p>
+            <w:r>
+              <w:t>审计者只读当前候选页。</w:t>
+            </w:r>
+          </w:p>
+        </w:tc>
+        <w:tc>
+          <w:tcPr>
+            <w:tcW w:type="dxa" w:w="3360"/>
+          </w:tcPr>
+          <w:p>
+            <w:r>
+              <w:t>l3-auto-passed / repair-queued</w:t>
+            </w:r>
+          </w:p>
+        </w:tc>
+      </w:tr>
+      <w:tr>
+        <w:tc>
+          <w:tcPr>
+            <w:tcW w:type="dxa" w:w="2100"/>
+          </w:tcPr>
+          <w:p>
+            <w:r>
+              <w:t>update-queued</w:t>
+            </w:r>
+          </w:p>
+        </w:tc>
+        <w:tc>
+          <w:tcPr>
+            <w:tcW w:type="dxa" w:w="3900"/>
+          </w:tcPr>
+          <w:p>
+            <w:r>
+              <w:t>已有页面收到只属于它的新材料。</w:t>
+            </w:r>
+          </w:p>
+        </w:tc>
+        <w:tc>
+          <w:tcPr>
+            <w:tcW w:type="dxa" w:w="3360"/>
+          </w:tcPr>
+          <w:p>
+            <w:r>
+              <w:t>updating</w:t>
+            </w:r>
+          </w:p>
+        </w:tc>
+      </w:tr>
+      <w:tr>
+        <w:tc>
+          <w:tcPr>
+            <w:tcW w:type="dxa" w:w="2100"/>
+          </w:tcPr>
+          <w:p>
+            <w:r>
+              <w:t>updating</w:t>
+            </w:r>
+          </w:p>
+        </w:tc>
+        <w:tc>
+          <w:tcPr>
+            <w:tcW w:type="dxa" w:w="3900"/>
+          </w:tcPr>
+          <w:p>
+            <w:r>
+              <w:t>融合补充材料，不从零重写。</w:t>
+            </w:r>
+          </w:p>
+        </w:tc>
+        <w:tc>
+          <w:tcPr>
+            <w:tcW w:type="dxa" w:w="3360"/>
+          </w:tcPr>
+          <w:p>
+            <w:r>
+              <w:t>audit-queued / manual-review</w:t>
+            </w:r>
+          </w:p>
+        </w:tc>
+      </w:tr>
+      <w:tr>
+        <w:tc>
+          <w:tcPr>
+            <w:tcW w:type="dxa" w:w="2100"/>
+          </w:tcPr>
+          <w:p>
+            <w:r>
+              <w:t>write-queued</w:t>
+            </w:r>
+          </w:p>
+        </w:tc>
+        <w:tc>
+          <w:tcPr>
+            <w:tcW w:type="dxa" w:w="3900"/>
+          </w:tcPr>
+          <w:p>
+            <w:r>
+              <w:t>批准的新节点等待首稿。</w:t>
+            </w:r>
+          </w:p>
+        </w:tc>
+        <w:tc>
+          <w:tcPr>
+            <w:tcW w:type="dxa" w:w="3360"/>
+          </w:tcPr>
+          <w:p>
+            <w:r>
               <w:t>writing</w:t>
             </w:r>
           </w:p>
@@ -1002,16 +1069,7 @@
             <w:tcW w:type="dxa" w:w="2100"/>
           </w:tcPr>
           <w:p>
-            <w:pPr>
-              <w:spacing w:after="0"/>
-              <w:jc w:val="center"/>
-            </w:pPr>
             <w:r>
-              <w:rPr>
-                <w:rFonts w:ascii="Calibri" w:hAnsi="Calibri" w:eastAsia="Microsoft YaHei"/>
-                <w:color w:val="111111"/>
-                <w:sz w:val="19"/>
-              </w:rPr>
               <w:t>writing</w:t>
             </w:r>
           </w:p>
@@ -1021,17 +1079,8 @@
             <w:tcW w:type="dxa" w:w="3900"/>
           </w:tcPr>
           <w:p>
-            <w:pPr>
-              <w:spacing w:after="0"/>
-              <w:jc w:val="left"/>
-            </w:pPr>
             <w:r>
-              <w:rPr>
-                <w:rFonts w:ascii="Calibri" w:hAnsi="Calibri" w:eastAsia="Microsoft YaHei"/>
-                <w:color w:val="111111"/>
-                <w:sz w:val="19"/>
-              </w:rPr>
-              <w:t>独立写作任务正在生成候选补丁。</w:t>
+              <w:t>只基于新节点事实包生成候选页。</w:t>
             </w:r>
           </w:p>
         </w:tc>
@@ -1040,17 +1089,8 @@
             <w:tcW w:type="dxa" w:w="3360"/>
           </w:tcPr>
           <w:p>
-            <w:pPr>
-              <w:spacing w:after="0"/>
-              <w:jc w:val="left"/>
-            </w:pPr>
             <w:r>
-              <w:rPr>
-                <w:rFonts w:ascii="Calibri" w:hAnsi="Calibri" w:eastAsia="Microsoft YaHei"/>
-                <w:color w:val="111111"/>
-                <w:sz w:val="19"/>
-              </w:rPr>
-              <w:t>draft-ready / blocked</w:t>
+              <w:t>audit-queued / manual-review</w:t>
             </w:r>
           </w:p>
         </w:tc>
@@ -1061,17 +1101,8 @@
             <w:tcW w:type="dxa" w:w="2100"/>
           </w:tcPr>
           <w:p>
-            <w:pPr>
-              <w:spacing w:after="0"/>
-              <w:jc w:val="center"/>
-            </w:pPr>
             <w:r>
-              <w:rPr>
-                <w:rFonts w:ascii="Calibri" w:hAnsi="Calibri" w:eastAsia="Microsoft YaHei"/>
-                <w:color w:val="111111"/>
-                <w:sz w:val="19"/>
-              </w:rPr>
-              <w:t>draft-ready</w:t>
+              <w:t>repair-queued</w:t>
             </w:r>
           </w:p>
         </w:tc>
@@ -1080,17 +1111,8 @@
             <w:tcW w:type="dxa" w:w="3900"/>
           </w:tcPr>
           <w:p>
-            <w:pPr>
-              <w:spacing w:after="0"/>
-              <w:jc w:val="left"/>
-            </w:pPr>
             <w:r>
-              <w:rPr>
-                <w:rFonts w:ascii="Calibri" w:hAnsi="Calibri" w:eastAsia="Microsoft YaHei"/>
-                <w:color w:val="111111"/>
-                <w:sz w:val="19"/>
-              </w:rPr>
-              <w:t>候选正文完成，但尚未获得任何质量称号。</w:t>
+              <w:t>等待按净化缺陷返修。</w:t>
             </w:r>
           </w:p>
         </w:tc>
@@ -1099,17 +1121,8 @@
             <w:tcW w:type="dxa" w:w="3360"/>
           </w:tcPr>
           <w:p>
-            <w:pPr>
-              <w:spacing w:after="0"/>
-              <w:jc w:val="left"/>
-            </w:pPr>
             <w:r>
-              <w:rPr>
-                <w:rFonts w:ascii="Calibri" w:hAnsi="Calibri" w:eastAsia="Microsoft YaHei"/>
-                <w:color w:val="111111"/>
-                <w:sz w:val="19"/>
-              </w:rPr>
-              <w:t>structural-check</w:t>
+              <w:t>repairing / manual-review</w:t>
             </w:r>
           </w:p>
         </w:tc>
@@ -1120,17 +1133,8 @@
             <w:tcW w:type="dxa" w:w="2100"/>
           </w:tcPr>
           <w:p>
-            <w:pPr>
-              <w:spacing w:after="0"/>
-              <w:jc w:val="center"/>
-            </w:pPr>
             <w:r>
-              <w:rPr>
-                <w:rFonts w:ascii="Calibri" w:hAnsi="Calibri" w:eastAsia="Microsoft YaHei"/>
-                <w:color w:val="111111"/>
-                <w:sz w:val="19"/>
-              </w:rPr>
-              <w:t>structural-check</w:t>
+              <w:t>repairing</w:t>
             </w:r>
           </w:p>
         </w:tc>
@@ -1139,17 +1143,8 @@
             <w:tcW w:type="dxa" w:w="3900"/>
           </w:tcPr>
           <w:p>
-            <w:pPr>
-              <w:spacing w:after="0"/>
-              <w:jc w:val="left"/>
-            </w:pPr>
             <w:r>
-              <w:rPr>
-                <w:rFonts w:ascii="Calibri" w:hAnsi="Calibri" w:eastAsia="Microsoft YaHei"/>
-                <w:color w:val="111111"/>
-                <w:sz w:val="19"/>
-              </w:rPr>
-              <w:t>运行 L1、L2 和确定性结构检查。</w:t>
+              <w:t>返修者看不到私有审计答案。</w:t>
             </w:r>
           </w:p>
         </w:tc>
@@ -1158,17 +1153,8 @@
             <w:tcW w:type="dxa" w:w="3360"/>
           </w:tcPr>
           <w:p>
-            <w:pPr>
-              <w:spacing w:after="0"/>
-              <w:jc w:val="left"/>
-            </w:pPr>
             <w:r>
-              <w:rPr>
-                <w:rFonts w:ascii="Calibri" w:hAnsi="Calibri" w:eastAsia="Microsoft YaHei"/>
-                <w:color w:val="111111"/>
-                <w:sz w:val="19"/>
-              </w:rPr>
-              <w:t>audit-queued / repair-queued</w:t>
+              <w:t>audit-queued / manual-review</w:t>
             </w:r>
           </w:p>
         </w:tc>
@@ -1179,17 +1165,8 @@
             <w:tcW w:type="dxa" w:w="2100"/>
           </w:tcPr>
           <w:p>
-            <w:pPr>
-              <w:spacing w:after="0"/>
-              <w:jc w:val="center"/>
-            </w:pPr>
             <w:r>
-              <w:rPr>
-                <w:rFonts w:ascii="Calibri" w:hAnsi="Calibri" w:eastAsia="Microsoft YaHei"/>
-                <w:color w:val="111111"/>
-                <w:sz w:val="19"/>
-              </w:rPr>
-              <w:t>audit-queued</w:t>
+              <w:t>manual-review</w:t>
             </w:r>
           </w:p>
         </w:tc>
@@ -1198,17 +1175,8 @@
             <w:tcW w:type="dxa" w:w="3900"/>
           </w:tcPr>
           <w:p>
-            <w:pPr>
-              <w:spacing w:after="0"/>
-              <w:jc w:val="left"/>
-            </w:pPr>
             <w:r>
-              <w:rPr>
-                <w:rFonts w:ascii="Calibri" w:hAnsi="Calibri" w:eastAsia="Microsoft YaHei"/>
-                <w:color w:val="111111"/>
-                <w:sz w:val="19"/>
-              </w:rPr>
-              <w:t>正文已冻结，等待独立六问审计。</w:t>
+              <w:t>两轮失败、规则冲突或发布异常。</w:t>
             </w:r>
           </w:p>
         </w:tc>
@@ -1217,17 +1185,8 @@
             <w:tcW w:type="dxa" w:w="3360"/>
           </w:tcPr>
           <w:p>
-            <w:pPr>
-              <w:spacing w:after="0"/>
-              <w:jc w:val="left"/>
-            </w:pPr>
             <w:r>
-              <w:rPr>
-                <w:rFonts w:ascii="Calibri" w:hAnsi="Calibri" w:eastAsia="Microsoft YaHei"/>
-                <w:color w:val="111111"/>
-                <w:sz w:val="19"/>
-              </w:rPr>
-              <w:t>auditing</w:t>
+              <w:t>人工决定 / retry</w:t>
             </w:r>
           </w:p>
         </w:tc>
@@ -1238,252 +1197,7 @@
             <w:tcW w:type="dxa" w:w="2100"/>
           </w:tcPr>
           <w:p>
-            <w:pPr>
-              <w:spacing w:after="0"/>
-              <w:jc w:val="center"/>
-            </w:pPr>
             <w:r>
-              <w:rPr>
-                <w:rFonts w:ascii="Calibri" w:hAnsi="Calibri" w:eastAsia="Microsoft YaHei"/>
-                <w:color w:val="111111"/>
-                <w:sz w:val="19"/>
-              </w:rPr>
-              <w:t>auditing</w:t>
-            </w:r>
-          </w:p>
-        </w:tc>
-        <w:tc>
-          <w:tcPr>
-            <w:tcW w:type="dxa" w:w="3900"/>
-          </w:tcPr>
-          <w:p>
-            <w:pPr>
-              <w:spacing w:after="0"/>
-              <w:jc w:val="left"/>
-            </w:pPr>
-            <w:r>
-              <w:rPr>
-                <w:rFonts w:ascii="Calibri" w:hAnsi="Calibri" w:eastAsia="Microsoft YaHei"/>
-                <w:color w:val="111111"/>
-                <w:sz w:val="19"/>
-              </w:rPr>
-              <w:t>审计者只读正文并生成哈希绑定审计。</w:t>
-            </w:r>
-          </w:p>
-        </w:tc>
-        <w:tc>
-          <w:tcPr>
-            <w:tcW w:type="dxa" w:w="3360"/>
-          </w:tcPr>
-          <w:p>
-            <w:pPr>
-              <w:spacing w:after="0"/>
-              <w:jc w:val="left"/>
-            </w:pPr>
-            <w:r>
-              <w:rPr>
-                <w:rFonts w:ascii="Calibri" w:hAnsi="Calibri" w:eastAsia="Microsoft YaHei"/>
-                <w:color w:val="111111"/>
-                <w:sz w:val="19"/>
-              </w:rPr>
-              <w:t>strict-l3-check</w:t>
-            </w:r>
-          </w:p>
-        </w:tc>
-      </w:tr>
-      <w:tr>
-        <w:tc>
-          <w:tcPr>
-            <w:tcW w:type="dxa" w:w="2100"/>
-          </w:tcPr>
-          <w:p>
-            <w:pPr>
-              <w:spacing w:after="0"/>
-              <w:jc w:val="center"/>
-            </w:pPr>
-            <w:r>
-              <w:rPr>
-                <w:rFonts w:ascii="Calibri" w:hAnsi="Calibri" w:eastAsia="Microsoft YaHei"/>
-                <w:color w:val="111111"/>
-                <w:sz w:val="19"/>
-              </w:rPr>
-              <w:t>strict-l3-check</w:t>
-            </w:r>
-          </w:p>
-        </w:tc>
-        <w:tc>
-          <w:tcPr>
-            <w:tcW w:type="dxa" w:w="3900"/>
-          </w:tcPr>
-          <w:p>
-            <w:pPr>
-              <w:spacing w:after="0"/>
-              <w:jc w:val="left"/>
-            </w:pPr>
-            <w:r>
-              <w:rPr>
-                <w:rFonts w:ascii="Calibri" w:hAnsi="Calibri" w:eastAsia="Microsoft YaHei"/>
-                <w:color w:val="111111"/>
-                <w:sz w:val="19"/>
-              </w:rPr>
-              <w:t>运行覆盖、融合、审计独立性和其他阻断。</w:t>
-            </w:r>
-          </w:p>
-        </w:tc>
-        <w:tc>
-          <w:tcPr>
-            <w:tcW w:type="dxa" w:w="3360"/>
-          </w:tcPr>
-          <w:p>
-            <w:pPr>
-              <w:spacing w:after="0"/>
-              <w:jc w:val="left"/>
-            </w:pPr>
-            <w:r>
-              <w:rPr>
-                <w:rFonts w:ascii="Calibri" w:hAnsi="Calibri" w:eastAsia="Microsoft YaHei"/>
-                <w:color w:val="111111"/>
-                <w:sz w:val="19"/>
-              </w:rPr>
-              <w:t>l3-auto-passed / repair-queued</w:t>
-            </w:r>
-          </w:p>
-        </w:tc>
-      </w:tr>
-      <w:tr>
-        <w:tc>
-          <w:tcPr>
-            <w:tcW w:type="dxa" w:w="2100"/>
-          </w:tcPr>
-          <w:p>
-            <w:pPr>
-              <w:spacing w:after="0"/>
-              <w:jc w:val="center"/>
-            </w:pPr>
-            <w:r>
-              <w:rPr>
-                <w:rFonts w:ascii="Calibri" w:hAnsi="Calibri" w:eastAsia="Microsoft YaHei"/>
-                <w:color w:val="111111"/>
-                <w:sz w:val="19"/>
-              </w:rPr>
-              <w:t>repair-queued</w:t>
-            </w:r>
-          </w:p>
-        </w:tc>
-        <w:tc>
-          <w:tcPr>
-            <w:tcW w:type="dxa" w:w="3900"/>
-          </w:tcPr>
-          <w:p>
-            <w:pPr>
-              <w:spacing w:after="0"/>
-              <w:jc w:val="left"/>
-            </w:pPr>
-            <w:r>
-              <w:rPr>
-                <w:rFonts w:ascii="Calibri" w:hAnsi="Calibri" w:eastAsia="Microsoft YaHei"/>
-                <w:color w:val="111111"/>
-                <w:sz w:val="19"/>
-              </w:rPr>
-              <w:t>缺陷已转成问题描述，等待全新返修任务。</w:t>
-            </w:r>
-          </w:p>
-        </w:tc>
-        <w:tc>
-          <w:tcPr>
-            <w:tcW w:type="dxa" w:w="3360"/>
-          </w:tcPr>
-          <w:p>
-            <w:pPr>
-              <w:spacing w:after="0"/>
-              <w:jc w:val="left"/>
-            </w:pPr>
-            <w:r>
-              <w:rPr>
-                <w:rFonts w:ascii="Calibri" w:hAnsi="Calibri" w:eastAsia="Microsoft YaHei"/>
-                <w:color w:val="111111"/>
-                <w:sz w:val="19"/>
-              </w:rPr>
-              <w:t>writing / manual-review</w:t>
-            </w:r>
-          </w:p>
-        </w:tc>
-      </w:tr>
-      <w:tr>
-        <w:tc>
-          <w:tcPr>
-            <w:tcW w:type="dxa" w:w="2100"/>
-          </w:tcPr>
-          <w:p>
-            <w:pPr>
-              <w:spacing w:after="0"/>
-              <w:jc w:val="center"/>
-            </w:pPr>
-            <w:r>
-              <w:rPr>
-                <w:rFonts w:ascii="Calibri" w:hAnsi="Calibri" w:eastAsia="Microsoft YaHei"/>
-                <w:color w:val="111111"/>
-                <w:sz w:val="19"/>
-              </w:rPr>
-              <w:t>manual-review</w:t>
-            </w:r>
-          </w:p>
-        </w:tc>
-        <w:tc>
-          <w:tcPr>
-            <w:tcW w:type="dxa" w:w="3900"/>
-          </w:tcPr>
-          <w:p>
-            <w:pPr>
-              <w:spacing w:after="0"/>
-              <w:jc w:val="left"/>
-            </w:pPr>
-            <w:r>
-              <w:rPr>
-                <w:rFonts w:ascii="Calibri" w:hAnsi="Calibri" w:eastAsia="Microsoft YaHei"/>
-                <w:color w:val="111111"/>
-                <w:sz w:val="19"/>
-              </w:rPr>
-              <w:t>两轮仍失败、规则冲突或存在高风险判断。</w:t>
-            </w:r>
-          </w:p>
-        </w:tc>
-        <w:tc>
-          <w:tcPr>
-            <w:tcW w:type="dxa" w:w="3360"/>
-          </w:tcPr>
-          <w:p>
-            <w:pPr>
-              <w:spacing w:after="0"/>
-              <w:jc w:val="left"/>
-            </w:pPr>
-            <w:r>
-              <w:rPr>
-                <w:rFonts w:ascii="Calibri" w:hAnsi="Calibri" w:eastAsia="Microsoft YaHei"/>
-                <w:color w:val="111111"/>
-                <w:sz w:val="19"/>
-              </w:rPr>
-              <w:t>人工决定</w:t>
-            </w:r>
-          </w:p>
-        </w:tc>
-      </w:tr>
-      <w:tr>
-        <w:tc>
-          <w:tcPr>
-            <w:tcW w:type="dxa" w:w="2100"/>
-          </w:tcPr>
-          <w:p>
-            <w:pPr>
-              <w:spacing w:after="0"/>
-              <w:jc w:val="center"/>
-            </w:pPr>
-            <w:r>
-              <w:rPr>
-                <w:rFonts w:ascii="Calibri" w:hAnsi="Calibri" w:eastAsia="Microsoft YaHei"/>
-                <w:color w:val="111111"/>
-                <w:sz w:val="19"/>
-              </w:rPr>
               <w:t>l3-auto-passed</w:t>
             </w:r>
           </w:p>
@@ -1493,17 +1207,8 @@
             <w:tcW w:type="dxa" w:w="3900"/>
           </w:tcPr>
           <w:p>
-            <w:pPr>
-              <w:spacing w:after="0"/>
-              <w:jc w:val="left"/>
-            </w:pPr>
             <w:r>
-              <w:rPr>
-                <w:rFonts w:ascii="Calibri" w:hAnsi="Calibri" w:eastAsia="Microsoft YaHei"/>
-                <w:color w:val="111111"/>
-                <w:sz w:val="19"/>
-              </w:rPr>
-              <w:t>自动 L3 与独立审计通过，不等于人工认证。</w:t>
+              <w:t>自动门禁通过并与当前内容哈希绑定。</w:t>
             </w:r>
           </w:p>
         </w:tc>
@@ -1512,76 +1217,8 @@
             <w:tcW w:type="dxa" w:w="3360"/>
           </w:tcPr>
           <w:p>
-            <w:pPr>
-              <w:spacing w:after="0"/>
-              <w:jc w:val="left"/>
-            </w:pPr>
             <w:r>
-              <w:rPr>
-                <w:rFonts w:ascii="Calibri" w:hAnsi="Calibri" w:eastAsia="Microsoft YaHei"/>
-                <w:color w:val="111111"/>
-                <w:sz w:val="19"/>
-              </w:rPr>
               <w:t>L4 人工审校</w:t>
-            </w:r>
-          </w:p>
-        </w:tc>
-      </w:tr>
-      <w:tr>
-        <w:tc>
-          <w:tcPr>
-            <w:tcW w:type="dxa" w:w="2100"/>
-          </w:tcPr>
-          <w:p>
-            <w:pPr>
-              <w:spacing w:after="0"/>
-              <w:jc w:val="center"/>
-            </w:pPr>
-            <w:r>
-              <w:rPr>
-                <w:rFonts w:ascii="Calibri" w:hAnsi="Calibri" w:eastAsia="Microsoft YaHei"/>
-                <w:color w:val="111111"/>
-                <w:sz w:val="19"/>
-              </w:rPr>
-              <w:t>l4-certified</w:t>
-            </w:r>
-          </w:p>
-        </w:tc>
-        <w:tc>
-          <w:tcPr>
-            <w:tcW w:type="dxa" w:w="3900"/>
-          </w:tcPr>
-          <w:p>
-            <w:pPr>
-              <w:spacing w:after="0"/>
-              <w:jc w:val="left"/>
-            </w:pPr>
-            <w:r>
-              <w:rPr>
-                <w:rFonts w:ascii="Calibri" w:hAnsi="Calibri" w:eastAsia="Microsoft YaHei"/>
-                <w:color w:val="111111"/>
-                <w:sz w:val="19"/>
-              </w:rPr>
-              <w:t>人工审校与当前内容哈希绑定。</w:t>
-            </w:r>
-          </w:p>
-        </w:tc>
-        <w:tc>
-          <w:tcPr>
-            <w:tcW w:type="dxa" w:w="3360"/>
-          </w:tcPr>
-          <w:p>
-            <w:pPr>
-              <w:spacing w:after="0"/>
-              <w:jc w:val="left"/>
-            </w:pPr>
-            <w:r>
-              <w:rPr>
-                <w:rFonts w:ascii="Calibri" w:hAnsi="Calibri" w:eastAsia="Microsoft YaHei"/>
-                <w:color w:val="111111"/>
-                <w:sz w:val="19"/>
-              </w:rPr>
-              <w:t>正文变化后失效</w:t>
             </w:r>
           </w:p>
         </w:tc>
@@ -1649,7 +1286,7 @@
           <w:color w:val="0B2545"/>
           <w:sz w:val="19"/>
         </w:rPr>
-        <w:t xml:space="preserve">  "id": "supervised-learning",</w:t>
+        <w:t xml:space="preserve">  "schemaVersion": 1,</w:t>
       </w:r>
     </w:p>
     <w:p>
@@ -1664,7 +1301,7 @@
           <w:color w:val="0B2545"/>
           <w:sz w:val="19"/>
         </w:rPr>
-        <w:t xml:space="preserve">  "sourcePath": "data/deepdive/supervised-learning.js",</w:t>
+        <w:t xml:space="preserve">  "mode": "serial",</w:t>
       </w:r>
     </w:p>
     <w:p>
@@ -1679,7 +1316,7 @@
           <w:color w:val="0B2545"/>
           <w:sz w:val="19"/>
         </w:rPr>
-        <w:t xml:space="preserve">  "state": "queued",</w:t>
+        <w:t xml:space="preserve">  "paused": true,</w:t>
       </w:r>
     </w:p>
     <w:p>
@@ -1694,7 +1331,7 @@
           <w:color w:val="0B2545"/>
           <w:sz w:val="19"/>
         </w:rPr>
-        <w:t xml:space="preserve">  "attempt": 0,</w:t>
+        <w:t xml:space="preserve">  "active": null,</w:t>
       </w:r>
     </w:p>
     <w:p>
@@ -1709,7 +1346,7 @@
           <w:color w:val="0B2545"/>
           <w:sz w:val="19"/>
         </w:rPr>
-        <w:t xml:space="preserve">  "contentHash": null,</w:t>
+        <w:t xml:space="preserve">  "items": {</w:t>
       </w:r>
     </w:p>
     <w:p>
@@ -1724,7 +1361,7 @@
           <w:color w:val="0B2545"/>
           <w:sz w:val="19"/>
         </w:rPr>
-        <w:t xml:space="preserve">  "auditHash": null,</w:t>
+        <w:t xml:space="preserve">    "supervised-learning": {</w:t>
       </w:r>
     </w:p>
     <w:p>
@@ -1739,7 +1376,7 @@
           <w:color w:val="0B2545"/>
           <w:sz w:val="19"/>
         </w:rPr>
-        <w:t xml:space="preserve">  "blockers": [],</w:t>
+        <w:t xml:space="preserve">      "state": "audit-queued", "attempt": 0,</w:t>
       </w:r>
     </w:p>
     <w:p>
@@ -1754,7 +1391,7 @@
           <w:color w:val="0B2545"/>
           <w:sz w:val="19"/>
         </w:rPr>
-        <w:t xml:space="preserve">  "editorialWarnings": [],</w:t>
+        <w:t xml:space="preserve">      "contentHash": "...", "auditHash": null</w:t>
       </w:r>
     </w:p>
     <w:p>
@@ -1769,7 +1406,7 @@
           <w:color w:val="0B2545"/>
           <w:sz w:val="19"/>
         </w:rPr>
-        <w:t xml:space="preserve">  "updatedAt": "2026-07-28T00:00:00Z"</w:t>
+        <w:t xml:space="preserve">    }</w:t>
       </w:r>
     </w:p>
     <w:p>
@@ -1784,7 +1421,7 @@
           <w:color w:val="0B2545"/>
           <w:sz w:val="19"/>
         </w:rPr>
-        <w:t>}</w:t>
+        <w:t xml:space="preserve">  }</w:t>
       </w:r>
     </w:p>
     <w:p>
@@ -1803,7 +1440,7 @@
           <w:color w:val="111111"/>
           <w:sz w:val="22"/>
         </w:rPr>
-        <w:t>正文变化：清空 auditHash，状态回退到 audit-queued。</w:t>
+        <w:t>}</w:t>
       </w:r>
     </w:p>
     <w:p>
@@ -1822,7 +1459,7 @@
           <w:color w:val="111111"/>
           <w:sz w:val="22"/>
         </w:rPr>
-        <w:t>审计文件变化但 pageHash 不匹配：进入 blocked，不得继续授予 L3。</w:t>
+        <w:t>正文变化：旧审计立即失效，状态回到 audit-queued。</w:t>
       </w:r>
     </w:p>
     <w:p>
@@ -1841,7 +1478,7 @@
           <w:color w:val="111111"/>
           <w:sz w:val="22"/>
         </w:rPr>
-        <w:t>自动检查通过但存在 editorial 警告：保留警告并进入抽样或人工队列。</w:t>
+        <w:t>全局只有一个 45 分钟租约；异常退出后过期任务自动回队。</w:t>
       </w:r>
     </w:p>
     <w:p>
@@ -1860,7 +1497,7 @@
           <w:color w:val="111111"/>
           <w:sz w:val="22"/>
         </w:rPr>
-        <w:t>返修 attempt 超过 2：强制进入 manual-review。</w:t>
+        <w:t>返修 attempt 超过 2，或发布后全局验证失败：进入 manual-review。</w:t>
       </w:r>
     </w:p>
     <w:p>
@@ -1910,17 +1547,7 @@
             <w:shd w:fill="E8EEF5"/>
           </w:tcPr>
           <w:p>
-            <w:pPr>
-              <w:spacing w:after="0"/>
-              <w:jc w:val="center"/>
-            </w:pPr>
             <w:r>
-              <w:rPr>
-                <w:rFonts w:ascii="Calibri" w:hAnsi="Calibri" w:eastAsia="Microsoft YaHei"/>
-                <w:b/>
-                <w:color w:val="0B2545"/>
-                <w:sz w:val="19"/>
-              </w:rPr>
               <w:t>角色</w:t>
             </w:r>
           </w:p>
@@ -1938,17 +1565,7 @@
             <w:shd w:fill="E8EEF5"/>
           </w:tcPr>
           <w:p>
-            <w:pPr>
-              <w:spacing w:after="0"/>
-              <w:jc w:val="center"/>
-            </w:pPr>
             <w:r>
-              <w:rPr>
-                <w:rFonts w:ascii="Calibri" w:hAnsi="Calibri" w:eastAsia="Microsoft YaHei"/>
-                <w:b/>
-                <w:color w:val="0B2545"/>
-                <w:sz w:val="19"/>
-              </w:rPr>
               <w:t>只允许接收</w:t>
             </w:r>
           </w:p>
@@ -1966,17 +1583,7 @@
             <w:shd w:fill="E8EEF5"/>
           </w:tcPr>
           <w:p>
-            <w:pPr>
-              <w:spacing w:after="0"/>
-              <w:jc w:val="center"/>
-            </w:pPr>
             <w:r>
-              <w:rPr>
-                <w:rFonts w:ascii="Calibri" w:hAnsi="Calibri" w:eastAsia="Microsoft YaHei"/>
-                <w:b/>
-                <w:color w:val="0B2545"/>
-                <w:sz w:val="19"/>
-              </w:rPr>
               <w:t>禁止行为</w:t>
             </w:r>
           </w:p>
@@ -1988,17 +1595,8 @@
             <w:tcW w:type="dxa" w:w="1500"/>
           </w:tcPr>
           <w:p>
-            <w:pPr>
-              <w:spacing w:after="0"/>
-              <w:jc w:val="center"/>
-            </w:pPr>
             <w:r>
-              <w:rPr>
-                <w:rFonts w:ascii="Calibri" w:hAnsi="Calibri" w:eastAsia="Microsoft YaHei"/>
-                <w:color w:val="111111"/>
-                <w:sz w:val="19"/>
-              </w:rPr>
-              <w:t>总控</w:t>
+              <w:t>控制器</w:t>
             </w:r>
           </w:p>
         </w:tc>
@@ -2007,17 +1605,8 @@
             <w:tcW w:type="dxa" w:w="4200"/>
           </w:tcPr>
           <w:p>
-            <w:pPr>
-              <w:spacing w:after="0"/>
-              <w:jc w:val="left"/>
-            </w:pPr>
             <w:r>
-              <w:rPr>
-                <w:rFonts w:ascii="Calibri" w:hAnsi="Calibri" w:eastAsia="Microsoft YaHei"/>
-                <w:color w:val="111111"/>
-                <w:sz w:val="19"/>
-              </w:rPr>
-              <w:t>状态、任务 ID、哈希、门禁结果和简短摘要。</w:t>
+              <w:t>状态、租约、哈希、候选、私有审计和门禁结果。</w:t>
             </w:r>
           </w:p>
         </w:tc>
@@ -2026,17 +1615,8 @@
             <w:tcW w:type="dxa" w:w="3660"/>
           </w:tcPr>
           <w:p>
-            <w:pPr>
-              <w:spacing w:after="0"/>
-              <w:jc w:val="left"/>
-            </w:pPr>
             <w:r>
-              <w:rPr>
-                <w:rFonts w:ascii="Calibri" w:hAnsi="Calibri" w:eastAsia="Microsoft YaHei"/>
-                <w:color w:val="111111"/>
-                <w:sz w:val="19"/>
-              </w:rPr>
-              <w:t>直接写正文；把其他页成品传给作者。</w:t>
+              <w:t>创作正文；把私有审计答案下发给返修者。</w:t>
             </w:r>
           </w:p>
         </w:tc>
@@ -2047,17 +1627,8 @@
             <w:tcW w:type="dxa" w:w="1500"/>
           </w:tcPr>
           <w:p>
-            <w:pPr>
-              <w:spacing w:after="0"/>
-              <w:jc w:val="center"/>
-            </w:pPr>
             <w:r>
-              <w:rPr>
-                <w:rFonts w:ascii="Calibri" w:hAnsi="Calibri" w:eastAsia="Microsoft YaHei"/>
-                <w:color w:val="111111"/>
-                <w:sz w:val="19"/>
-              </w:rPr>
-              <w:t>写作者</w:t>
+              <w:t>write</w:t>
             </w:r>
           </w:p>
         </w:tc>
@@ -2066,17 +1637,8 @@
             <w:tcW w:type="dxa" w:w="4200"/>
           </w:tcPr>
           <w:p>
-            <w:pPr>
-              <w:spacing w:after="0"/>
-              <w:jc w:val="left"/>
-            </w:pPr>
             <w:r>
-              <w:rPr>
-                <w:rFonts w:ascii="Calibri" w:hAnsi="Calibri" w:eastAsia="Microsoft YaHei"/>
-                <w:color w:val="111111"/>
-                <w:sz w:val="19"/>
-              </w:rPr>
-              <w:t>当前页、写作原则、当前页问题清单。</w:t>
+              <w:t>新节点事实、关系、路径、来源和写作政策。</w:t>
             </w:r>
           </w:p>
         </w:tc>
@@ -2085,17 +1647,8 @@
             <w:tcW w:type="dxa" w:w="3660"/>
           </w:tcPr>
           <w:p>
-            <w:pPr>
-              <w:spacing w:after="0"/>
-              <w:jc w:val="left"/>
-            </w:pPr>
             <w:r>
-              <w:rPr>
-                <w:rFonts w:ascii="Calibri" w:hAnsi="Calibri" w:eastAsia="Microsoft YaHei"/>
-                <w:color w:val="111111"/>
-                <w:sz w:val="19"/>
-              </w:rPr>
-              <w:t>读取审计答案；修改审计；连续写多页。</w:t>
+              <w:t>读取其他页面；生成审计；直接发布。</w:t>
             </w:r>
           </w:p>
         </w:tc>
@@ -2106,17 +1659,8 @@
             <w:tcW w:type="dxa" w:w="1500"/>
           </w:tcPr>
           <w:p>
-            <w:pPr>
-              <w:spacing w:after="0"/>
-              <w:jc w:val="center"/>
-            </w:pPr>
             <w:r>
-              <w:rPr>
-                <w:rFonts w:ascii="Calibri" w:hAnsi="Calibri" w:eastAsia="Microsoft YaHei"/>
-                <w:color w:val="111111"/>
-                <w:sz w:val="19"/>
-              </w:rPr>
-              <w:t>审计者</w:t>
+              <w:t>update</w:t>
             </w:r>
           </w:p>
         </w:tc>
@@ -2125,17 +1669,8 @@
             <w:tcW w:type="dxa" w:w="4200"/>
           </w:tcPr>
           <w:p>
-            <w:pPr>
-              <w:spacing w:after="0"/>
-              <w:jc w:val="left"/>
-            </w:pPr>
             <w:r>
-              <w:rPr>
-                <w:rFonts w:ascii="Calibri" w:hAnsi="Calibri" w:eastAsia="Microsoft YaHei"/>
-                <w:color w:val="111111"/>
-                <w:sz w:val="19"/>
-              </w:rPr>
-              <w:t>冻结正文、六问定义和审计格式。</w:t>
+              <w:t>当前页、当前页补充材料和写作政策。</w:t>
             </w:r>
           </w:p>
         </w:tc>
@@ -2144,16 +1679,39 @@
             <w:tcW w:type="dxa" w:w="3660"/>
           </w:tcPr>
           <w:p>
-            <w:pPr>
-              <w:spacing w:after="0"/>
-              <w:jc w:val="left"/>
-            </w:pPr>
             <w:r>
-              <w:rPr>
-                <w:rFonts w:ascii="Calibri" w:hAnsi="Calibri" w:eastAsia="Microsoft YaHei"/>
-                <w:color w:val="111111"/>
-                <w:sz w:val="19"/>
-              </w:rPr>
+              <w:t>从零重写；读取无关视频材料。</w:t>
+            </w:r>
+          </w:p>
+        </w:tc>
+      </w:tr>
+      <w:tr>
+        <w:tc>
+          <w:tcPr>
+            <w:tcW w:type="dxa" w:w="1500"/>
+          </w:tcPr>
+          <w:p>
+            <w:r>
+              <w:t>audit</w:t>
+            </w:r>
+          </w:p>
+        </w:tc>
+        <w:tc>
+          <w:tcPr>
+            <w:tcW w:type="dxa" w:w="4200"/>
+          </w:tcPr>
+          <w:p>
+            <w:r>
+              <w:t>当前候选页、六问定义和审计格式。</w:t>
+            </w:r>
+          </w:p>
+        </w:tc>
+        <w:tc>
+          <w:tcPr>
+            <w:tcW w:type="dxa" w:w="3660"/>
+          </w:tcPr>
+          <w:p>
+            <w:r>
               <w:t>修改正文；查看作者理由；替作者补答案。</w:t>
             </w:r>
           </w:p>
@@ -2165,17 +1723,8 @@
             <w:tcW w:type="dxa" w:w="1500"/>
           </w:tcPr>
           <w:p>
-            <w:pPr>
-              <w:spacing w:after="0"/>
-              <w:jc w:val="center"/>
-            </w:pPr>
             <w:r>
-              <w:rPr>
-                <w:rFonts w:ascii="Calibri" w:hAnsi="Calibri" w:eastAsia="Microsoft YaHei"/>
-                <w:color w:val="111111"/>
-                <w:sz w:val="19"/>
-              </w:rPr>
-              <w:t>返修者</w:t>
+              <w:t>repair</w:t>
             </w:r>
           </w:p>
         </w:tc>
@@ -2184,17 +1733,8 @@
             <w:tcW w:type="dxa" w:w="4200"/>
           </w:tcPr>
           <w:p>
-            <w:pPr>
-              <w:spacing w:after="0"/>
-              <w:jc w:val="left"/>
-            </w:pPr>
             <w:r>
-              <w:rPr>
-                <w:rFonts w:ascii="Calibri" w:hAnsi="Calibri" w:eastAsia="Microsoft YaHei"/>
-                <w:color w:val="111111"/>
-                <w:sz w:val="19"/>
-              </w:rPr>
-              <w:t>当前正文和缺陷描述，不含标准答案。</w:t>
+              <w:t>当前候选页、净化缺陷和写作政策。</w:t>
             </w:r>
           </w:p>
         </w:tc>
@@ -2203,17 +1743,8 @@
             <w:tcW w:type="dxa" w:w="3660"/>
           </w:tcPr>
           <w:p>
-            <w:pPr>
-              <w:spacing w:after="0"/>
-              <w:jc w:val="left"/>
-            </w:pPr>
             <w:r>
-              <w:rPr>
-                <w:rFonts w:ascii="Calibri" w:hAnsi="Calibri" w:eastAsia="Microsoft YaHei"/>
-                <w:color w:val="111111"/>
-                <w:sz w:val="19"/>
-              </w:rPr>
-              <w:t>追加六问收束段；读取门禁正则找漏洞。</w:t>
+              <w:t>读取私有审计；追加六问收束段。</w:t>
             </w:r>
           </w:p>
         </w:tc>
@@ -2251,7 +1782,7 @@
           <w:color w:val="111111"/>
           <w:sz w:val="22"/>
         </w:rPr>
-        <w:t>在一个总控话题下，每个页面都创建新的子任务，并显式设置 fork_turns="none"。这会切断父话题历史和前一个页面输出。一个子任务完成一页后立即结束，不复用于下一页。</w:t>
+        <w:t>Codex 桌面定时任务每次都创建新的独立对话，并且不绑定项目。它不会继承上一轮聊天；本地项目材料只能通过 ai-knowledge-map-stage2 MCP 的三个窄工具取得。</w:t>
       </w:r>
     </w:p>
     <w:p>
@@ -2266,7 +1797,7 @@
           <w:color w:val="0B2545"/>
           <w:sz w:val="19"/>
         </w:rPr>
-        <w:t>总控话题（只调度）</w:t>
+        <w:t>定时唤醒（无项目、全新对话）</w:t>
       </w:r>
     </w:p>
     <w:p>
@@ -2281,7 +1812,7 @@
           <w:color w:val="0B2545"/>
           <w:sz w:val="19"/>
         </w:rPr>
-        <w:t xml:space="preserve">  -&gt; writer-page-a  [fork_turns=none]</w:t>
+        <w:t xml:space="preserve">  -&gt; stage2_claim_task（最多返回一个最小任务包）</w:t>
       </w:r>
     </w:p>
     <w:p>
@@ -2296,7 +1827,7 @@
           <w:color w:val="0B2545"/>
           <w:sz w:val="19"/>
         </w:rPr>
-        <w:t xml:space="preserve">  -&gt; writer-page-b  [fork_turns=none]</w:t>
+        <w:t xml:space="preserve">  -&gt; 当前角色完成任务</w:t>
       </w:r>
     </w:p>
     <w:p>
@@ -2311,7 +1842,22 @@
           <w:color w:val="0B2545"/>
           <w:sz w:val="19"/>
         </w:rPr>
-        <w:t xml:space="preserve">  -&gt; writer-page-c  [fork_turns=none]</w:t>
+        <w:t xml:space="preserve">  -&gt; stage2_submit_result（只提交一次）</w:t>
+      </w:r>
+    </w:p>
+    <w:p>
+      <w:pPr>
+        <w:pStyle w:val="CodeBlock"/>
+        <w:widowControl/>
+        <w:spacing w:before="0" w:after="0"/>
+      </w:pPr>
+      <w:r>
+        <w:rPr>
+          <w:rFonts w:ascii="Consolas" w:hAnsi="Consolas" w:eastAsia="Microsoft YaHei"/>
+          <w:color w:val="0B2545"/>
+          <w:sz w:val="19"/>
+        </w:rPr>
+        <w:t xml:space="preserve">  -&gt; 结束；下一次定时运行重新创建对话</w:t>
       </w:r>
     </w:p>
     <w:p>
@@ -2340,7 +1886,6 @@
           <w:color w:val="0B2545"/>
           <w:sz w:val="19"/>
         </w:rPr>
-        <w:t>审计阶段重新创建：</w:t>
       </w:r>
     </w:p>
     <w:p>
@@ -2355,14 +1900,13 @@
           <w:color w:val="0B2545"/>
           <w:sz w:val="19"/>
         </w:rPr>
-        <w:t xml:space="preserve">  -&gt; audit-page-a   [fork_turns=none]</w:t>
       </w:r>
     </w:p>
     <w:p>
       <w:pPr>
         <w:pStyle w:val="CodeBlock"/>
         <w:widowControl/>
-        <w:spacing w:before="0" w:after="0"/>
+        <w:spacing w:before="0" w:after="100"/>
       </w:pPr>
       <w:r>
         <w:rPr>
@@ -2370,22 +1914,6 @@
           <w:color w:val="0B2545"/>
           <w:sz w:val="19"/>
         </w:rPr>
-        <w:t xml:space="preserve">  -&gt; audit-page-b   [fork_turns=none]</w:t>
-      </w:r>
-    </w:p>
-    <w:p>
-      <w:pPr>
-        <w:pStyle w:val="CodeBlock"/>
-        <w:widowControl/>
-        <w:spacing w:before="0" w:after="100"/>
-      </w:pPr>
-      <w:r>
-        <w:rPr>
-          <w:rFonts w:ascii="Consolas" w:hAnsi="Consolas" w:eastAsia="Microsoft YaHei"/>
-          <w:color w:val="0B2545"/>
-          <w:sz w:val="19"/>
-        </w:rPr>
-        <w:t xml:space="preserve">  -&gt; audit-page-c   [fork_turns=none]</w:t>
       </w:r>
     </w:p>
     <w:p>
@@ -2405,7 +1933,7 @@
           <w:color w:val="7A5A00"/>
           <w:sz w:val="22"/>
         </w:rPr>
-        <w:t xml:space="preserve">重要限制  </w:t>
+        <w:t>重要边界  新对话解决历史上下文污染；无项目运行和窄 MCP 解决材料暴露；控制器独占正式写入解决权限隔离。提示词仍约束 Agent 不主动寻找额外材料，因此这是适合本项目的混合隔离，不宣称操作系统级绝对沙箱。</w:t>
       </w:r>
       <w:r>
         <w:rPr>
@@ -2413,7 +1941,6 @@
           <w:color w:val="111111"/>
           <w:sz w:val="22"/>
         </w:rPr>
-        <w:t>fork_turns="none" 隔离的是对话历史，不是共享文件系统权限。同一项目中的子任务技术上仍可能主动读取其他文件，因此还需要单页任务包和路径白名单。若要求真正的硬隔离，必须使用单独沙箱。</w:t>
       </w:r>
     </w:p>
     <w:p>
@@ -2442,7 +1969,7 @@
           <w:color w:val="111111"/>
           <w:sz w:val="22"/>
         </w:rPr>
-        <w:t>写作者不直接编辑正式页面。总控为每页生成最小任务包，写作者只在任务包中产生候选文件，再由总控检查并应用补丁。</w:t>
+        <w:t>Agent 不直接编辑正式页面。控制器按角色动态返回 JSON 任务包，并把候选页、私有审计和回执分开保存。</w:t>
       </w:r>
     </w:p>
     <w:p>
@@ -2472,7 +1999,7 @@
           <w:color w:val="0B2545"/>
           <w:sz w:val="19"/>
         </w:rPr>
-        <w:t xml:space="preserve">  packets/</w:t>
+        <w:t xml:space="preserve">  state.json            唯一进度事实源</w:t>
       </w:r>
     </w:p>
     <w:p>
@@ -2487,7 +2014,7 @@
           <w:color w:val="0B2545"/>
           <w:sz w:val="19"/>
         </w:rPr>
-        <w:t xml:space="preserve">    supervised-learning/</w:t>
+        <w:t xml:space="preserve">  policies/             写作者可见规则，不含审计答案</w:t>
       </w:r>
     </w:p>
     <w:p>
@@ -2502,7 +2029,7 @@
           <w:color w:val="0B2545"/>
           <w:sz w:val="19"/>
         </w:rPr>
-        <w:t xml:space="preserve">      page.js</w:t>
+        <w:t xml:space="preserve">  results/&lt;page-id&gt;/</w:t>
       </w:r>
     </w:p>
     <w:p>
@@ -2517,7 +2044,7 @@
           <w:color w:val="0B2545"/>
           <w:sz w:val="19"/>
         </w:rPr>
-        <w:t xml:space="preserve">      writing-policy.md</w:t>
+        <w:t xml:space="preserve">    candidate.json      尚未发布的候选页面</w:t>
       </w:r>
     </w:p>
     <w:p>
@@ -2532,7 +2059,7 @@
           <w:color w:val="0B2545"/>
           <w:sz w:val="19"/>
         </w:rPr>
-        <w:t xml:space="preserve">      defects.json</w:t>
+        <w:t xml:space="preserve">    audit.private.json  不交给返修者的独立审计</w:t>
       </w:r>
     </w:p>
     <w:p>
@@ -2547,7 +2074,7 @@
           <w:color w:val="0B2545"/>
           <w:sz w:val="19"/>
         </w:rPr>
-        <w:t xml:space="preserve">  results/</w:t>
+        <w:t xml:space="preserve">    completion.json     哈希绑定的发布回执</w:t>
       </w:r>
     </w:p>
     <w:p>
@@ -2562,7 +2089,6 @@
           <w:color w:val="0B2545"/>
           <w:sz w:val="19"/>
         </w:rPr>
-        <w:t xml:space="preserve">    supervised-learning/</w:t>
       </w:r>
     </w:p>
     <w:p>
@@ -2577,7 +2103,6 @@
           <w:color w:val="0B2545"/>
           <w:sz w:val="19"/>
         </w:rPr>
-        <w:t xml:space="preserve">      candidate.js</w:t>
       </w:r>
     </w:p>
     <w:p>
@@ -2592,7 +2117,6 @@
           <w:color w:val="0B2545"/>
           <w:sz w:val="19"/>
         </w:rPr>
-        <w:t xml:space="preserve">      result.json</w:t>
       </w:r>
     </w:p>
     <w:p>
@@ -2611,7 +2135,7 @@
           <w:color w:val="111111"/>
           <w:sz w:val="22"/>
         </w:rPr>
-        <w:t>page.js：只包含当前页，不包含其他页面成品。</w:t>
+        <w:t>audit 包：当前候选页与六问合同；不含写作者对话和旧审计。</w:t>
       </w:r>
     </w:p>
     <w:p>
@@ -2630,7 +2154,7 @@
           <w:color w:val="111111"/>
           <w:sz w:val="22"/>
         </w:rPr>
-        <w:t>writing-policy.md：稳定的写作原则，不包含六问答案和门禁实现。</w:t>
+        <w:t>write 包：新节点事实、关系、路径、来源与写作政策；只用于新节点。</w:t>
       </w:r>
     </w:p>
     <w:p>
@@ -2649,7 +2173,7 @@
           <w:color w:val="111111"/>
           <w:sz w:val="22"/>
         </w:rPr>
-        <w:t>defects.json：描述读者看不到什么，不提供可直接粘贴的答案。</w:t>
+        <w:t>update 包：当前页面与只属于该页的视频补充材料。</w:t>
       </w:r>
     </w:p>
     <w:p>
@@ -2668,7 +2192,7 @@
           <w:color w:val="111111"/>
           <w:sz w:val="22"/>
         </w:rPr>
-        <w:t>candidate.js：候选正文；总控验证作用域后才应用到正式文件。</w:t>
+        <w:t>repair 包：当前候选页与净化缺陷；不含私有审计答案。</w:t>
       </w:r>
     </w:p>
     <w:p>
@@ -2856,7 +2380,7 @@
           <w:color w:val="111111"/>
           <w:sz w:val="22"/>
         </w:rPr>
-        <w:t>使用全新审计任务，只读当前正文并生成 docs/deepdive-audits/&lt;id&gt;.json。</w:t>
+        <w:t>使用全新审计任务，只读当前候选页并提交私有、哈希绑定的六问审计。</w:t>
       </w:r>
     </w:p>
     <w:p>
@@ -3059,7 +2583,7 @@
           <w:color w:val="111111"/>
           <w:sz w:val="22"/>
         </w:rPr>
-        <w:t>每完成一轮 3 页，自动横向比较以下信号：</w:t>
+        <w:t>每次发布后，控制器可横向检查以下重复信号；该检查不要求并行批次：</w:t>
       </w:r>
     </w:p>
     <w:p>
@@ -3167,7 +2691,7 @@
           <w:color w:val="111111"/>
           <w:sz w:val="22"/>
         </w:rPr>
-        <w:t>若连续页面出现同构骨架，暂停队列并将本轮送入 manual-review，不得继续批量传播。</w:t>
+        <w:t>若连续页面出现同构骨架，暂停队列并送入 manual-review，不得继续传播。</w:t>
       </w:r>
     </w:p>
     <w:p>
@@ -3242,7 +2766,7 @@
           <w:color w:val="2E74B5"/>
           <w:sz w:val="26"/>
         </w:rPr>
-        <w:t>11.3 并发与文件锁</w:t>
+        <w:t>11.3 串行租约与唯一写入口</w:t>
       </w:r>
     </w:p>
     <w:p>
@@ -3261,7 +2785,7 @@
           <w:color w:val="111111"/>
           <w:sz w:val="22"/>
         </w:rPr>
-        <w:t>并发度固定为 3；每个工作者只处理 1 页。</w:t>
+        <w:t>全局并发固定为 1；每次 Codex 运行只处理一页的一个阶段。</w:t>
       </w:r>
     </w:p>
     <w:p>
@@ -3280,7 +2804,7 @@
           <w:color w:val="111111"/>
           <w:sz w:val="22"/>
         </w:rPr>
-        <w:t>同一源文件包含多个页面时，这些页面必须串行处理。</w:t>
+        <w:t>同一时间只有一个有效租约，租约默认 45 分钟。</w:t>
       </w:r>
     </w:p>
     <w:p>
@@ -3299,7 +2823,7 @@
           <w:color w:val="111111"/>
           <w:sz w:val="22"/>
         </w:rPr>
-        <w:t>写作者只产生候选文件；正式文件由总控单线程应用。</w:t>
+        <w:t>Agent 只提交候选或审计；正式文件由控制器单线程原子发布。</w:t>
       </w:r>
     </w:p>
     <w:p>
@@ -3318,7 +2842,7 @@
           <w:color w:val="111111"/>
           <w:sz w:val="22"/>
         </w:rPr>
-        <w:t>任何任务超时或异常退出都释放租约，页面回到 queued 或 blocked。</w:t>
+        <w:t>任何任务超时或异常退出都释放或到期回收租约，页面回到对应排队状态。</w:t>
       </w:r>
     </w:p>
     <w:p>
@@ -3354,7 +2878,7 @@
           <w:color w:val="9B1C1C"/>
           <w:sz w:val="22"/>
         </w:rPr>
-        <w:t xml:space="preserve">尚未实现  </w:t>
+        <w:t>已经实现  以下命令操作真实 Stage 2 状态；自动内容任务通过 MCP 领取，不要求用户逐页输入。</w:t>
       </w:r>
       <w:r>
         <w:rPr>
@@ -3362,7 +2886,6 @@
           <w:color w:val="111111"/>
           <w:sz w:val="22"/>
         </w:rPr>
-        <w:t>以下命令是第二阶段调度器的建议接口，不代表当前仓库已经存在对应脚本。</w:t>
       </w:r>
     </w:p>
     <w:p>
@@ -3375,7 +2898,7 @@
           <w:color w:val="111111"/>
           <w:sz w:val="22"/>
         </w:rPr>
-        <w:t>初始化队列：</w:t>
+        <w:t>初始化存量页面与视频补充：</w:t>
       </w:r>
     </w:p>
     <w:p>
@@ -3403,34 +2926,6 @@
           <w:color w:val="111111"/>
           <w:sz w:val="22"/>
         </w:rPr>
-        <w:t>运行或继续，最多并行 3 页：</w:t>
-      </w:r>
-    </w:p>
-    <w:p>
-      <w:pPr>
-        <w:pStyle w:val="CodeBlock"/>
-        <w:widowControl/>
-        <w:spacing w:before="100" w:after="100"/>
-      </w:pPr>
-      <w:r>
-        <w:rPr>
-          <w:rFonts w:ascii="Consolas" w:hAnsi="Consolas" w:eastAsia="Microsoft YaHei"/>
-          <w:color w:val="0B2545"/>
-          <w:sz w:val="19"/>
-        </w:rPr>
-        <w:t>node tools/run-deepdive-stage2.js run --concurrency 3</w:t>
-      </w:r>
-    </w:p>
-    <w:p>
-      <w:pPr>
-        <w:widowControl/>
-      </w:pPr>
-      <w:r>
-        <w:rPr>
-          <w:rFonts w:ascii="Calibri" w:hAnsi="Calibri" w:eastAsia="Microsoft YaHei"/>
-          <w:color w:val="111111"/>
-          <w:sz w:val="22"/>
-        </w:rPr>
         <w:t>查看状态：</w:t>
       </w:r>
     </w:p>
@@ -3459,7 +2954,7 @@
           <w:color w:val="111111"/>
           <w:sz w:val="22"/>
         </w:rPr>
-        <w:t>只重试指定页面：</w:t>
+        <w:t>暂停和恢复：</w:t>
       </w:r>
     </w:p>
     <w:p>
@@ -3467,34 +2962,6 @@
         <w:pStyle w:val="CodeBlock"/>
         <w:widowControl/>
         <w:spacing w:before="100" w:after="100"/>
-      </w:pPr>
-      <w:r>
-        <w:rPr>
-          <w:rFonts w:ascii="Consolas" w:hAnsi="Consolas" w:eastAsia="Microsoft YaHei"/>
-          <w:color w:val="0B2545"/>
-          <w:sz w:val="19"/>
-        </w:rPr>
-        <w:t>node tools/run-deepdive-stage2.js retry supervised-learning</w:t>
-      </w:r>
-    </w:p>
-    <w:p>
-      <w:pPr>
-        <w:widowControl/>
-      </w:pPr>
-      <w:r>
-        <w:rPr>
-          <w:rFonts w:ascii="Calibri" w:hAnsi="Calibri" w:eastAsia="Microsoft YaHei"/>
-          <w:color w:val="111111"/>
-          <w:sz w:val="22"/>
-        </w:rPr>
-        <w:t>暂停和继续：</w:t>
-      </w:r>
-    </w:p>
-    <w:p>
-      <w:pPr>
-        <w:pStyle w:val="CodeBlock"/>
-        <w:widowControl/>
-        <w:spacing w:before="100" w:after="0"/>
       </w:pPr>
       <w:r>
         <w:rPr>
@@ -3507,9 +2974,22 @@
     </w:p>
     <w:p>
       <w:pPr>
+        <w:widowControl/>
+      </w:pPr>
+      <w:r>
+        <w:rPr>
+          <w:rFonts w:ascii="Calibri" w:hAnsi="Calibri" w:eastAsia="Microsoft YaHei"/>
+          <w:color w:val="111111"/>
+          <w:sz w:val="22"/>
+        </w:rPr>
+        <w:t>node tools/run-deepdive-stage2.js resume</w:t>
+      </w:r>
+    </w:p>
+    <w:p>
+      <w:pPr>
         <w:pStyle w:val="CodeBlock"/>
         <w:widowControl/>
-        <w:spacing w:before="0" w:after="100"/>
+        <w:spacing w:before="100" w:after="100"/>
       </w:pPr>
       <w:r>
         <w:rPr>
@@ -3517,7 +2997,7 @@
           <w:color w:val="0B2545"/>
           <w:sz w:val="19"/>
         </w:rPr>
-        <w:t>node tools/run-deepdive-stage2.js resume</w:t>
+        <w:t>只重试指定页面：node tools/run-deepdive-stage2.js retry supervised-learning</w:t>
       </w:r>
     </w:p>
     <w:p>
@@ -3530,7 +3010,49 @@
           <w:color w:val="111111"/>
           <w:sz w:val="22"/>
         </w:rPr>
-        <w:t>Node 调度器负责状态、任务包、哈希、锁和候选补丁；Codex 总控话题负责创建 fork_turns="none" 的子任务。用户不需要为 130 页逐条输入命令。</w:t>
+        <w:t>MCP 服务：</w:t>
+      </w:r>
+    </w:p>
+    <w:p>
+      <w:pPr>
+        <w:pStyle w:val="CodeBlock"/>
+        <w:widowControl/>
+        <w:spacing w:before="100" w:after="0"/>
+      </w:pPr>
+      <w:r>
+        <w:rPr>
+          <w:rFonts w:ascii="Consolas" w:hAnsi="Consolas" w:eastAsia="Microsoft YaHei"/>
+          <w:color w:val="0B2545"/>
+          <w:sz w:val="19"/>
+        </w:rPr>
+        <w:t>node tools/deepdive-stage2/mcp-server.js</w:t>
+      </w:r>
+    </w:p>
+    <w:p>
+      <w:pPr>
+        <w:pStyle w:val="CodeBlock"/>
+        <w:widowControl/>
+        <w:spacing w:before="0" w:after="100"/>
+      </w:pPr>
+      <w:r>
+        <w:rPr>
+          <w:rFonts w:ascii="Consolas" w:hAnsi="Consolas" w:eastAsia="Microsoft YaHei"/>
+          <w:color w:val="0B2545"/>
+          <w:sz w:val="19"/>
+        </w:rPr>
+      </w:r>
+    </w:p>
+    <w:p>
+      <w:pPr>
+        <w:widowControl/>
+      </w:pPr>
+      <w:r>
+        <w:rPr>
+          <w:rFonts w:ascii="Calibri" w:hAnsi="Calibri" w:eastAsia="Microsoft YaHei"/>
+          <w:color w:val="111111"/>
+          <w:sz w:val="22"/>
+        </w:rPr>
+        <w:t>Codex 桌面自动化只负责定时唤醒；仓库控制器负责状态、最小任务包、哈希、锁、门禁、发布和回滚。</w:t>
       </w:r>
     </w:p>
     <w:p>
@@ -3654,7 +3176,7 @@
           <w:color w:val="111111"/>
           <w:sz w:val="22"/>
         </w:rPr>
-        <w:t>每批随机抽取 1 页，用于监测自动门禁未覆盖的问题。</w:t>
+        <w:t>正式运行中定期抽样，用于监测自动门禁未覆盖的问题。</w:t>
       </w:r>
     </w:p>
     <w:p>
@@ -3711,7 +3233,7 @@
           <w:color w:val="111111"/>
           <w:sz w:val="22"/>
         </w:rPr>
-        <w:t>正式放开 130 页前，先选 3 种不同缺陷类型：</w:t>
+        <w:t>正式放开 130 页前，先覆盖三种真实路径：</w:t>
       </w:r>
     </w:p>
     <w:p>
@@ -3730,7 +3252,7 @@
           <w:color w:val="111111"/>
           <w:sz w:val="22"/>
         </w:rPr>
-        <w:t>一页存在明显节尾收束段，用于验证 Integration 阻断与融入式返修。</w:t>
+        <w:t>一页没有补充材料的存量页面，用于验证 audit -&gt; pass / repair。</w:t>
       </w:r>
     </w:p>
     <w:p>
@@ -3749,7 +3271,7 @@
           <w:color w:val="111111"/>
           <w:sz w:val="22"/>
         </w:rPr>
-        <w:t>一页六问覆盖大量缺失，用于验证 Coverage 缺陷包是否足够指导重写。</w:t>
+        <w:t>一页收到视频补充的已有页面，用于验证 update -&gt; audit。</w:t>
       </w:r>
     </w:p>
     <w:p>
@@ -3768,7 +3290,7 @@
           <w:color w:val="111111"/>
           <w:sz w:val="22"/>
         </w:rPr>
-        <w:t>一页内容基本完整但章节参差或文风僵硬，用于验证 Editorial 提示不会扼杀创造性。</w:t>
+        <w:t>一个经过批准的新节点，用于验证 write -&gt; audit -&gt; 原子集成。</w:t>
       </w:r>
     </w:p>
     <w:p>
@@ -3800,7 +3322,7 @@
           <w:color w:val="111111"/>
           <w:sz w:val="22"/>
         </w:rPr>
-        <w:t>三个写作任务均为 fork_turns="none"；</w:t>
+        <w:t>每个阶段都由新的无项目 Codex 对话执行；</w:t>
       </w:r>
     </w:p>
     <w:p>
@@ -3819,7 +3341,7 @@
           <w:color w:val="111111"/>
           <w:sz w:val="22"/>
         </w:rPr>
-        <w:t>写作任务没有读取或修改独立审计；</w:t>
+        <w:t>每次只取得一个最小任务包，只提交一次；</w:t>
       </w:r>
     </w:p>
     <w:p>
@@ -3838,7 +3360,7 @@
           <w:color w:val="111111"/>
           <w:sz w:val="22"/>
         </w:rPr>
-        <w:t>审计任务没有修改正文；</w:t>
+        <w:t>审计者不能修改正文，返修者看不到私有审计答案；</w:t>
       </w:r>
     </w:p>
     <w:p>
@@ -3857,7 +3379,7 @@
           <w:color w:val="111111"/>
           <w:sz w:val="22"/>
         </w:rPr>
-        <w:t>拆段、列表和提示框不能绕过节尾证据集中检测；</w:t>
+        <w:t>候选内容在门禁前没有进入正式页面；</w:t>
       </w:r>
     </w:p>
     <w:p>
@@ -3895,7 +3417,7 @@
           <w:color w:val="111111"/>
           <w:sz w:val="22"/>
         </w:rPr>
-        <w:t>每页最多两轮返修，超限能够进入人工队列；</w:t>
+        <w:t>发布失败能完整回滚，两轮返修失败能进入人工队列；</w:t>
       </w:r>
     </w:p>
     <w:p>
@@ -3914,7 +3436,7 @@
           <w:color w:val="111111"/>
           <w:sz w:val="22"/>
         </w:rPr>
-        <w:t>三页之间未出现明显同构章节骨架。</w:t>
+        <w:t>视频教程轨未受影响，新节点和补充没有绕过 Stage 2。</w:t>
       </w:r>
     </w:p>
     <w:p>
@@ -3944,7 +3466,7 @@
           <w:color w:val="0B2545"/>
           <w:sz w:val="22"/>
         </w:rPr>
-        <w:t>阶段 A：</w:t>
+        <w:t>阶段 A（已完成）：状态文件、事件日志、串行租约和内容哈希。</w:t>
       </w:r>
       <w:r>
         <w:rPr>
@@ -3952,7 +3474,6 @@
           <w:color w:val="111111"/>
           <w:sz w:val="22"/>
         </w:rPr>
-        <w:t>实现状态文件、事件日志、页面锁和内容哈希。</w:t>
       </w:r>
     </w:p>
     <w:p>
@@ -3966,7 +3487,7 @@
           <w:color w:val="0B2545"/>
           <w:sz w:val="22"/>
         </w:rPr>
-        <w:t>阶段 B：</w:t>
+        <w:t>阶段 B（已完成）：四类最小任务包、候选结果目录和角色校验。</w:t>
       </w:r>
       <w:r>
         <w:rPr>
@@ -3974,7 +3495,6 @@
           <w:color w:val="111111"/>
           <w:sz w:val="22"/>
         </w:rPr>
-        <w:t>实现单页任务包、候选结果目录和作用域检查。</w:t>
       </w:r>
     </w:p>
     <w:p>
@@ -3988,7 +3508,7 @@
           <w:color w:val="0B2545"/>
           <w:sz w:val="22"/>
         </w:rPr>
-        <w:t>阶段 C：</w:t>
+        <w:t>阶段 C（已完成）：独立六问审计、审计失效和净化返修缺陷。</w:t>
       </w:r>
       <w:r>
         <w:rPr>
@@ -3996,7 +3516,6 @@
           <w:color w:val="111111"/>
           <w:sz w:val="22"/>
         </w:rPr>
-        <w:t>把独立六问审计接入状态流转，并验证正文变化会使审计失效。</w:t>
       </w:r>
     </w:p>
     <w:p>
@@ -4010,7 +3529,7 @@
           <w:color w:val="0B2545"/>
           <w:sz w:val="22"/>
         </w:rPr>
-        <w:t>阶段 D：</w:t>
+        <w:t>阶段 D（已完成）：两轮返修上限、门禁、原子发布与回滚。</w:t>
       </w:r>
       <w:r>
         <w:rPr>
@@ -4018,7 +3537,6 @@
           <w:color w:val="111111"/>
           <w:sz w:val="22"/>
         </w:rPr>
-        <w:t>实现重复模式熔断、两轮返修上限和人工队列。</w:t>
       </w:r>
     </w:p>
     <w:p>
@@ -4032,7 +3550,7 @@
           <w:color w:val="0B2545"/>
           <w:sz w:val="22"/>
         </w:rPr>
-        <w:t>阶段 E：</w:t>
+        <w:t>阶段 E（已完成）：视频 supplement 与新节点事实包接入、旧入口阻断。</w:t>
       </w:r>
       <w:r>
         <w:rPr>
@@ -4040,7 +3558,6 @@
           <w:color w:val="111111"/>
           <w:sz w:val="22"/>
         </w:rPr>
-        <w:t>运行三页试点；人工确认后再开放剩余页面。</w:t>
       </w:r>
     </w:p>
     <w:p>
@@ -4054,7 +3571,7 @@
           <w:color w:val="0B2545"/>
           <w:sz w:val="22"/>
         </w:rPr>
-        <w:t>阶段 F：</w:t>
+        <w:t>阶段 F（待执行）：运行三页真实试点；人工确认后恢复队列并启用定时任务。</w:t>
       </w:r>
       <w:r>
         <w:rPr>
@@ -4062,7 +3579,6 @@
           <w:color w:val="111111"/>
           <w:sz w:val="22"/>
         </w:rPr>
-        <w:t>按每轮 3 页持续执行，定期提交 Git 检查点。</w:t>
       </w:r>
     </w:p>
     <w:p>
@@ -4129,7 +3645,7 @@
           <w:color w:val="111111"/>
           <w:sz w:val="22"/>
         </w:rPr>
-        <w:t>每个写作、审计和返修任务均为全新上下文，且一次只处理一页。</w:t>
+        <w:t>每个写作、更新、审计和返修阶段均为全新上下文，且一次只处理一页。</w:t>
       </w:r>
     </w:p>
     <w:p>
@@ -4148,7 +3664,7 @@
           <w:color w:val="111111"/>
           <w:sz w:val="22"/>
         </w:rPr>
-        <w:t>所有任务状态、尝试次数、哈希和阻断项都能从状态文件恢复。</w:t>
+        <w:t>所有状态、尝试次数、租约、哈希和阻断项都能从状态文件与事件日志恢复。</w:t>
       </w:r>
     </w:p>
     <w:p>
@@ -4167,7 +3683,7 @@
           <w:color w:val="111111"/>
           <w:sz w:val="22"/>
         </w:rPr>
-        <w:t>正文作者无法通过同步填写审计而自我证明合格。</w:t>
+        <w:t>正文作者无法修改私有审计，也不能直接写正式页面来证明自己合格。</w:t>
       </w:r>
     </w:p>
     <w:p>
@@ -4186,7 +3702,7 @@
           <w:color w:val="111111"/>
           <w:sz w:val="22"/>
         </w:rPr>
-        <w:t>节尾收束段拆成多个段落、列表或提示框仍会被识别。</w:t>
+        <w:t>返修者只收到净化缺陷，不得到可直接复制的六问答案。</w:t>
       </w:r>
     </w:p>
     <w:p>
@@ -4205,7 +3721,7 @@
           <w:color w:val="111111"/>
           <w:sz w:val="22"/>
         </w:rPr>
-        <w:t>纯追加合同答案会通过 Git 基线比较被阻断。</w:t>
+        <w:t>机械门禁失败时正式文件完整回滚；新节点必须整体原子集成。</w:t>
       </w:r>
     </w:p>
     <w:p>
@@ -4224,7 +3740,7 @@
           <w:color w:val="111111"/>
           <w:sz w:val="22"/>
         </w:rPr>
-        <w:t>文风正则只产生编辑提示，不因机械换词而损害正文创造性。</w:t>
+        <w:t>视频教程轨与概念判断轨保持原职责，不与 Stage 2 争写正文。</w:t>
       </w:r>
     </w:p>
     <w:p>
@@ -4262,7 +3778,45 @@
           <w:color w:val="111111"/>
           <w:sz w:val="22"/>
         </w:rPr>
-        <w:t>三页试点通过后，才允许扩大到剩余页面。</w:t>
+        <w:t>三页试点通过后，才允许恢复 130 页队列和启用定时任务。</w:t>
+      </w:r>
+    </w:p>
+    <w:p>
+      <w:pPr>
+        <w:pStyle w:val="Heading1"/>
+      </w:pPr>
+      <w:r>
+        <w:t>17. 与视频双轨入库的边界</w:t>
+      </w:r>
+    </w:p>
+    <w:p>
+      <w:pPr/>
+      <w:r>
+        <w:t>教程轨保持不变：网址、视频证据、软件目录与使用教程仍由原流程处理，不进入 Stage 2。</w:t>
+      </w:r>
+    </w:p>
+    <w:p>
+      <w:pPr/>
+      <w:r>
+        <w:t>概念轨仍负责判断 supplement、merge、reject、新节点和核心候选；它不再生成或发布理解原理页。</w:t>
+      </w:r>
+    </w:p>
+    <w:p>
+      <w:pPr/>
+      <w:r>
+        <w:t>supplement 进入目标页的 update-queued；新节点以节点、关系、学习路径、来源和证据事实包进入 write-queued。</w:t>
+      </w:r>
+    </w:p>
+    <w:p>
+      <w:pPr/>
+      <w:r>
+        <w:t>只有 Stage 2 完成独立审计和门禁后，控制器才原子发布页面；新节点同时集成图谱、路径和核心身份。</w:t>
+      </w:r>
+    </w:p>
+    <w:p>
+      <w:pPr/>
+      <w:r>
+        <w:t>旧 video:node-apply 若没有哈希绑定的 stage2Completion 会被拒绝，因此两个系统不存在正式写入冲突。</w:t>
       </w:r>
     </w:p>
     <w:p>
@@ -4293,7 +3847,7 @@
           <w:color w:val="0B2545"/>
           <w:sz w:val="19"/>
         </w:rPr>
-        <w:t>建立并启动第二阶段状态机，并行度为 3。</w:t>
+        <w:t>只使用 ai-knowledge-map-stage2 MCP，不打开本地项目，不读取额外文件。</w:t>
       </w:r>
     </w:p>
     <w:p>
@@ -4308,7 +3862,7 @@
           <w:color w:val="0B2545"/>
           <w:sz w:val="19"/>
         </w:rPr>
-        <w:t>每个写作、审计和返修任务都使用 fork_turns=none。</w:t>
+        <w:t>调用 stage2_claim_task 一次；paused、busy 或 idle 时立即结束。</w:t>
       </w:r>
     </w:p>
     <w:p>
@@ -4323,7 +3877,7 @@
           <w:color w:val="0B2545"/>
           <w:sz w:val="19"/>
         </w:rPr>
-        <w:t>写作任务一次只处理一页，不继承其他页面输出。</w:t>
+        <w:t>严格按照任务包中的 role 完成当前一页，不处理第二页。</w:t>
       </w:r>
     </w:p>
     <w:p>
@@ -4338,7 +3892,7 @@
           <w:color w:val="0B2545"/>
           <w:sz w:val="19"/>
         </w:rPr>
-        <w:t>审计与正文编辑严格分离。</w:t>
+        <w:t>调用 stage2_submit_result 一次，然后结束本次任务。</w:t>
       </w:r>
     </w:p>
     <w:p>
@@ -4353,7 +3907,7 @@
           <w:color w:val="0B2545"/>
           <w:sz w:val="19"/>
         </w:rPr>
-        <w:t>出现人工判断、两轮返修失败或重复模式熔断时暂停并报告。</w:t>
+        <w:t>audit 不改正文；write/update/repair 不生成审计。repair 只使用净化缺陷。</w:t>
       </w:r>
     </w:p>
     <w:sectPr>

</xml_diff>